<commit_message>
EHP VIF thresholds: implement VIF 5/10/free full-controls models; primary VIF<10; update manuscript and cover letter
Co-Authored-By: Tatsuki Onishi <bougtoir@gmail.com>
</commit_message>
<xml_diff>
--- a/output/manuscript/heat_crash_mortality.docx
+++ b/output/manuscript/heat_crash_mortality.docx
@@ -85,7 +85,7 @@
         <w:t xml:space="preserve">Findings </w:t>
       </w:r>
       <w:r>
-        <w:t>In the USA (272,586 crash deaths), a +9°C anomaly raised same-day crash mortality, RR 1.165 (95% CI 1.135-1.196), and remained similar in a VIF-screened model adjusting for state population (offset) and precipitation (VIF &gt; 5 iteratively dropped vmt_state, humidex_anom, heat_index_anom, wbgt_est_anom; RR 1.165 (1.135-1.196); cumulative RR 1.083 (1.023-1.146)). The excess was larger for open-air users (motorcyclists RR 2.140, pedestrians RR 1.215) than vehicle occupants (RR 1.050). Net heat-attributable deaths were 528 per year (1.36%), similar to 527 recorded direct-heat deaths (ICD-10 X30); +1 to +3°C warming projected 347-1009 additional deaths per year. Japan data (11,576 deaths) were too sparse for a precise estimate.</w:t>
+        <w:t>In the USA (272,586 crash deaths), a +9°C anomaly raised same-day crash mortality, RR 1.165 (95% CI 1.135-1.196), and remained similar in a VIF-screened full-controls model (VIF threshold 10; retained log-population offset, daily precipitation and estimated WBGT anomaly; iteratively dropped vmt_state, humidex_anom, heat_index_anom; RR 1.170 (1.122-1.219); cumulative RR 1.086 (1.019-1.157)). The excess was larger for open-air users (motorcyclists RR 2.140, pedestrians RR 1.215) than vehicle occupants (RR 1.050). Net heat-attributable deaths were 528 per year (1.36%), similar to 527 recorded direct-heat deaths (ICD-10 X30); +1 to +3°C warming projected 347-1009 additional deaths per year. Japan data (11,576 deaths) were too sparse for a precise estimate.</w:t>
       </w:r>
     </w:p>
     <w:p>
@@ -529,7 +529,7 @@
         <w:t>13</w:t>
       </w:r>
       <w:r>
-        <w:t xml:space="preserve"> and daily state precipitation, all as z-scored linear terms except the population offset, plus GHCN-derived heat-stress metrics (humidex, NOAA heat index, and an estimated wet-bulb globe temperature) expressed as anomalies relative to their day-of-year climatology. Because heat-stress metrics are functions of temperature and can be collinear with the anomaly exposure, we selected the primary full-controls model by a variance-inflation-factor (VIF) screen (iteratively dropping added controls with VIF &gt; 5), and tested the heat-stress metrics individually as sensitivity analyses. State fixed effects capture time-invariant cross-state differences in baseline risk, while the log-population offset scales expected counts within each state across years; because state annual VMT is correlated with population size, the two partly adjust for the same scale factor, so their simultaneous use is reported as a sensitivity analysis rather than the primary specification. Officially recorded direct-heat deaths (International Classification of Diseases, 10th revision [ICD-10] code X30) were obtained from CDC WONDER.</w:t>
+        <w:t xml:space="preserve"> and daily state precipitation, all as z-scored linear terms except the population offset, plus GHCN-derived heat-stress metrics (humidex, NOAA heat index, and an estimated wet-bulb globe temperature) expressed as anomalies relative to their day-of-year climatology. Because heat-stress metrics are functions of temperature and can be collinear with the anomaly exposure, we selected the primary full-controls model by a variance-inflation-factor (VIF) screen (iteratively dropping added controls with VIF &gt; 10). A stricter VIF &lt; 5 screen and an unscreened model retaining all candidate controls were also fitted and reported as sensitivity analyses. Heat-stress metrics were tested individually because they are functions of temperature. State fixed effects capture time-invariant cross-state differences in baseline risk, while the log-population offset scales expected counts within each state across years; because state annual VMT is correlated with population size, the two partly adjust for the same scale factor, so their simultaneous use is reported as a sensitivity analysis rather than the primary specification. Officially recorded direct-heat deaths (International Classification of Diseases, 10th revision [ICD-10] code X30) were obtained from CDC WONDER.</w:t>
       </w:r>
       <w:r>
         <w:rPr>
@@ -899,7 +899,7 @@
         <w:spacing w:after="120" w:line="480" w:lineRule="auto"/>
       </w:pPr>
       <w:r>
-        <w:t>The lag structure showed an acute same-day excess followed by a deficit at 1-3 days, RR 0.936 (0.904-0.968), consistent with short-term displacement (harvesting) rather than a net addition of deaths (Fig. 3; Table 2). The same-day association was essentially unchanged after adjusting for national vehicle-miles travelled and gasoline supplied (RR 1.163, 95% CI 1.133-1.194; cumulative RR 1.075 (1.015-1.138)). A variance-inflation-factor (VIF) screened full-controls model—starting with state population as a log offset plus z-scored state annual VMT, daily precipitation and the three heat-stress metrics, then iteratively dropping any added control with VIF &gt; 5—retained only the log-population offset and daily precipitation. Iteratively dropped variables were vmt_state, humidex_anom, heat_index_anom, wbgt_est_anom. Its same-day RR remained similar (RR 1.165 (1.135-1.196), 95% CI 1.135-1.196), but the cumulative 0-10 day RR was attenuated (RR 1.083 (1.023-1.146)). Heat-stress metrics were tested individually because they are functions of temperature and can be collinear with the anomaly; they yielded variable same-day estimates and the heat-index model attenuated toward the null.</w:t>
+        <w:t>The lag structure showed an acute same-day excess followed by a deficit at 1-3 days, RR 0.936 (0.904-0.968), consistent with short-term displacement (harvesting) rather than a net addition of deaths (Fig. 3; Table 2). The same-day association was essentially unchanged after adjusting for national vehicle-miles travelled and gasoline supplied (RR 1.163, 95% CI 1.133-1.194; cumulative RR 1.075 (1.015-1.138)). A variance-inflation-factor (VIF) screened full-controls model—starting with state population as a log offset plus z-scored state annual VMT, daily precipitation and the three heat-stress metrics, then iteratively dropping any added control with VIF &gt; 10—retained log-population offset, daily precipitation and estimated WBGT anomaly. Iteratively dropped variables were vmt_state, humidex_anom, heat_index_anom. Its same-day RR remained similar (RR 1.170 (1.122-1.219)), but the cumulative 0-10 day RR was attenuated (RR 1.086 (1.019-1.157)). A stricter VIF &lt; 5 screen retained daily precipitation (RR 1.165 (1.135-1.196); cumulative RR 1.083 (1.023-1.146)), while the unscreened full-controls model attenuated toward the null (RR 1.070 (1.021-1.121); cumulative RR 1.005 (0.941-1.073); max control VIF 323.8). Heat-stress metrics were tested individually because they are functions of temperature and can be collinear with the anomaly; they yielded variable same-day estimates and the heat-index model attenuated toward the null.</w:t>
       </w:r>
     </w:p>
     <w:p/>
@@ -2007,7 +2007,7 @@
         <w:spacing w:after="120" w:line="480" w:lineRule="auto"/>
       </w:pPr>
       <w:r>
-        <w:t>Sensitivity to activity, precipitation and heat-stress controls is summarized in Table 6. All added continuous terms were z-scored linear terms; state population entered as a log offset, and heat-stress metrics were expressed as anomalies relative to their day-of-year climatology. The primary full-controls model was selected by iteratively removing added controls with VIF &gt; 5; dropped variables were vmt_state (VIF=323.8); humidex_anom (VIF=63.5); heat_index_anom (VIF=24.5); wbgt_est_anom (VIF=8.5). Heat-stress metrics showed high collinearity with the temperature anomaly when entered individually, so they are reported separately as sensitivity analyses rather than being included simultaneously.</w:t>
+        <w:t>Sensitivity to activity, precipitation and heat-stress controls is summarized in Table 6. All added continuous terms were z-scored linear terms; state population entered as a log offset, and heat-stress metrics were expressed as anomalies relative to their day-of-year climatology. The primary full-controls model was selected by iteratively removing added controls with VIF &gt; 10; dropped variables were vmt_state (VIF=323.8); humidex_anom (VIF=63.5); heat_index_anom (VIF=24.5). A stricter VIF &lt; 5 screen and an unscreened full-controls model are also shown. Heat-stress metrics showed high collinearity with the temperature anomaly when entered individually, so they are reported separately as sensitivity analyses rather than being included simultaneously.</w:t>
       </w:r>
     </w:p>
     <w:p>
@@ -2021,7 +2021,7 @@
         <w:t xml:space="preserve">Table 6. </w:t>
       </w:r>
       <w:r>
-        <w:t>United States sensitivity of the +9 °C anomaly association to activity, precipitation and heat-stress controls. All added continuous controls were z-scored; population entered as a log offset; heat-stress metrics were anomaly-derived. The VIF-screened row is the primary full-controls model, selected by iteratively removing added controls with VIF &gt; 5. Heat-stress metrics were tested individually because they are functions of temperature and can be collinear with the anomaly.</w:t>
+        <w:t>United States sensitivity of the +9 °C anomaly association to activity, precipitation and heat-stress controls. All added continuous controls were z-scored; population entered as a log offset; heat-stress metrics were anomaly-derived. The VIF &lt; 10 row is the primary full-controls model, selected by iteratively removing added controls with VIF &gt; 10. A stricter VIF &lt; 5 screen and an unscreened model are also shown. Heat-stress metrics were tested individually because they are functions of temperature and can be collinear with the anomaly.</w:t>
       </w:r>
     </w:p>
     <w:tbl>
@@ -2265,7 +2265,91 @@
           </w:tcPr>
           <w:p>
             <w:r>
-              <w:t>VIF-screened full controls</w:t>
+              <w:t>Full controls, no VIF screen</w:t>
+            </w:r>
+          </w:p>
+        </w:tc>
+        <w:tc>
+          <w:tcPr>
+            <w:tcW w:type="dxa" w:w="2160"/>
+          </w:tcPr>
+          <w:p>
+            <w:r>
+              <w:t>1.070 (1.021-1.121)</w:t>
+            </w:r>
+          </w:p>
+        </w:tc>
+        <w:tc>
+          <w:tcPr>
+            <w:tcW w:type="dxa" w:w="2160"/>
+          </w:tcPr>
+          <w:p>
+            <w:r>
+              <w:t>1.005 (0.941-1.073)</w:t>
+            </w:r>
+          </w:p>
+        </w:tc>
+        <w:tc>
+          <w:tcPr>
+            <w:tcW w:type="dxa" w:w="2160"/>
+          </w:tcPr>
+          <w:p>
+            <w:r>
+              <w:t>323.8</w:t>
+            </w:r>
+          </w:p>
+        </w:tc>
+      </w:tr>
+      <w:tr>
+        <w:tc>
+          <w:tcPr>
+            <w:tcW w:type="dxa" w:w="2160"/>
+          </w:tcPr>
+          <w:p>
+            <w:r>
+              <w:t>VIF-screened full controls (VIF &lt; 10)</w:t>
+            </w:r>
+          </w:p>
+        </w:tc>
+        <w:tc>
+          <w:tcPr>
+            <w:tcW w:type="dxa" w:w="2160"/>
+          </w:tcPr>
+          <w:p>
+            <w:r>
+              <w:t>1.170 (1.122-1.219)</w:t>
+            </w:r>
+          </w:p>
+        </w:tc>
+        <w:tc>
+          <w:tcPr>
+            <w:tcW w:type="dxa" w:w="2160"/>
+          </w:tcPr>
+          <w:p>
+            <w:r>
+              <w:t>1.086 (1.019-1.157)</w:t>
+            </w:r>
+          </w:p>
+        </w:tc>
+        <w:tc>
+          <w:tcPr>
+            <w:tcW w:type="dxa" w:w="2160"/>
+          </w:tcPr>
+          <w:p>
+            <w:r>
+              <w:t>8.5</w:t>
+            </w:r>
+          </w:p>
+        </w:tc>
+      </w:tr>
+      <w:tr>
+        <w:tc>
+          <w:tcPr>
+            <w:tcW w:type="dxa" w:w="2160"/>
+          </w:tcPr>
+          <w:p>
+            <w:r>
+              <w:t>VIF-screened full controls (VIF &lt; 5)</w:t>
             </w:r>
           </w:p>
         </w:tc>
@@ -2567,7 +2651,7 @@
         <w:spacing w:after="120" w:line="480" w:lineRule="auto"/>
       </w:pPr>
       <w:r>
-        <w:t>A +9 °C temperature anomaly was associated with a same-day rate ratio of 1.165 (95% CI 1.135-1.196) for US traffic-crash deaths, and the net annual heat-attributable burden was 528 deaths (95% CI 425-631), similar to the 527 officially recorded direct-heat deaths per year. This acute, same-day excess was not explained by aggregate driving activity, and it remained in the VIF-screened full-controls model (added controls iteratively removed when VIF &gt; 5, retaining only the log-population offset and daily precipitation; dropped: vmt_state, humidex_anom, heat_index_anom, wbgt_est_anom), RR 1.165 (1.135-1.196), 95% CI 1.135-1.196). The cumulative 0-10 day RR in that model was attenuated (RR 1.083 (1.023-1.146)). The 1-3 day deficit indicates that part of the excess reflects short-term displacement (harvesting). These findings are consistent with heat-related impairment or under-recognised heat illness contributing to road deaths without appearing in cause-of-death data.</w:t>
+        <w:t>A +9 °C temperature anomaly was associated with a same-day rate ratio of 1.165 (95% CI 1.135-1.196) for US traffic-crash deaths, and the net annual heat-attributable burden was 528 deaths (95% CI 425-631), similar to the 527 officially recorded direct-heat deaths per year. This acute, same-day excess was not explained by aggregate driving activity, and it remained in the VIF-screened full-controls model (added controls iteratively removed when VIF &gt; 10, retaining log-population offset, daily precipitation and estimated WBGT anomaly; dropped: vmt_state, humidex_anom, heat_index_anom), RR 1.170 (1.122-1.219)). The cumulative 0-10 day RR in that model was attenuated (RR 1.086 (1.019-1.157)). The 1-3 day deficit indicates that part of the excess reflects short-term displacement (harvesting). These findings are consistent with heat-related impairment or under-recognised heat illness contributing to road deaths without appearing in cause-of-death data.</w:t>
       </w:r>
       <w:r>
         <w:rPr>

</xml_diff>

<commit_message>
Add Europe data limitation and CARE reference to EHP manuscript
- Limitations: note absence of open daily individual-level European crash database

- Add CARE reference and cite it in the US/Japan best-available-source paragraph

- Regenerate color and B/W EHP packages

- Update sync-to-repos mapping to track the new Europe-limitation branch

Co-Authored-By: Tatsuki Onishi <bougtoir@gmail.com>
</commit_message>
<xml_diff>
--- a/output/manuscript/heat_crash_mortality.docx
+++ b/output/manuscript/heat_crash_mortality.docx
@@ -2689,7 +2689,16 @@
         <w:spacing w:after="120" w:line="480" w:lineRule="auto"/>
       </w:pPr>
       <w:r>
-        <w:t>Several limitations apply. First, this is an ecological, population-level association: it cannot establish that heat caused illness in any specific crash, and neither FARS nor NPA records post-mortem heat diagnosis. Second, exposure is measured at the state/prefecture level from the nearest GHCN-Daily station; this misclassifies individual exposure and does not capture sub-unit variation such as urban heat islands. We therefore added state population as an offset and evaluated GHCN-derived humidity, heat-index and estimated wet-bulb globe temperature metrics in sensitivity models, but these station-based heat-stress measures still do not measure personal exposure. Third, activity adjustment used national monthly proxies for the main model and annual state VMT for the sensitivity model; neither is daily, mode-specific or shared-mobility-specific, and daily state-level or mode-specific activity could alter the road-user and time-of-day gradients. In particular, publicly available daily national counts of pedestrian, bicycle and shared-mobility trips are not available, so we cannot directly separate a weather-related activity shift from a physiological or mechanical heat effect for those modes. Fourth, the Japanese analysis is an exploratory external validation only; its shorter series, far smaller death counts and sparser GHCN-Daily coverage preclude a precise estimate, and we do not pool the two countries. Fifth, the warming projection is a scenario calculation that holds driving activity, the vehicle fleet and behaviour fixed and assumes the anomaly response is stable under a warmer mean climate; it should be read as illustrative of magnitude, not as a forecast. Sixth, the road-user, age and time-of-day subgroup analyses are exploratory: they entail multiple comparisons without formal adjustment, and the open-air road-user gradient may in part reflect weather-related differences in activity rather than physiology. Seventh, the quasi-Poisson model accounts for overdispersion but does not include an explicit autoregressive error term; although the distributed-lag, seasonal, trend and day-of-week controls absorb much short-term temporal autocorrelation, unmodelled residual serial correlation could affect confidence intervals. These findings should motivate, but cannot replace, individual-level studies linking crash decedents to ambient heat and, where available, post-mortem findings.</w:t>
+        <w:t>Several limitations apply. First, this is an ecological, population-level association: it cannot establish that heat caused illness in any specific crash, and neither FARS nor NPA records post-mortem heat diagnosis. Second, exposure is measured at the state/prefecture level from the nearest GHCN-Daily station; this misclassifies individual exposure and does not capture sub-unit variation such as urban heat islands. We therefore added state population as an offset and evaluated GHCN-derived humidity, heat-index and estimated wet-bulb globe temperature metrics in sensitivity models, but these station-based heat-stress measures still do not measure personal exposure. Third, activity adjustment used national monthly proxies for the main model and annual state VMT for the sensitivity model; neither is daily, mode-specific or shared-mobility-specific, and daily state-level or mode-specific activity could alter the road-user and time-of-day gradients. In particular, publicly available daily national counts of pedestrian, bicycle and shared-mobility trips are not available, so we cannot directly separate a weather-related activity shift from a physiological or mechanical heat effect for those modes. Fourth, the Japanese analysis is an exploratory external validation only; its shorter series, far smaller death counts and sparser GHCN-Daily coverage preclude a precise estimate, and we do not pool the two countries. Fifth, the warming projection is a scenario calculation that holds driving activity, the vehicle fleet and behaviour fixed and assumes the anomaly response is stable under a warmer mean climate; it should be read as illustrative of magnitude, not as a forecast. Sixth, the road-user, age and time-of-day subgroup analyses are exploratory: they entail multiple comparisons without formal adjustment, and the open-air road-user gradient may in part reflect weather-related differences in activity rather than physiology. Seventh, the quasi-Poisson model accounts for overdispersion but does not include an explicit autoregressive error term; although the distributed-lag, seasonal, trend and day-of-week controls absorb much short-term temporal autocorrelation, unmodelled residual serial correlation could affect confidence intervals. Eighth, the findings are drawn from the United States and Japan because, among high-income countries with comparably robust road-crash and meteorological data collection, no other country currently provides a fully open, daily, individual-level crash record equivalent to FARS or the Japanese NPA open data; the EU CARE database contains detailed individual accident records but is not publicly available at the daily individual level, and national open road-safety datasets in Europe are not harmonised, so the United States and Japan represent the best available public sources for this study design.</w:t>
+      </w:r>
+      <w:r>
+        <w:rPr>
+          <w:vertAlign w:val="superscript"/>
+        </w:rPr>
+        <w:t>17</w:t>
+      </w:r>
+      <w:r>
+        <w:t xml:space="preserve"> These findings should motivate, but cannot replace, individual-level studies linking crash decedents to ambient heat and, where available, post-mortem findings.</w:t>
       </w:r>
     </w:p>
     <w:p>
@@ -2922,6 +2931,14 @@
       </w:pPr>
       <w:r>
         <w:t>16. IPCC. Climate Change 2021: The Physical Science Basis. Contribution of Working Group I to the Sixth Assessment Report of the Intergovernmental Panel on Climate Change. Cambridge: Cambridge University Press; 2021.</w:t>
+      </w:r>
+    </w:p>
+    <w:p>
+      <w:pPr>
+        <w:spacing w:after="80"/>
+      </w:pPr>
+      <w:r>
+        <w:t>17. European Commission, Directorate-General for Mobility and Transport. Community database on road accidents (CARE). https://road-safety.transport.ec.europa.eu/european-road-safety-observatory/methodology-and-research/care-database_en</w:t>
       </w:r>
     </w:p>
     <w:sectPr>

</xml_diff>